<commit_message>
Restructure report headings and optimize images
Agent-Logs-Url: https://github.com/WANG-Siqi547/flowernet-agent/sessions/e253cb71-39ed-4037-a888-b947c6845e90

Co-authored-by: WANG-Siqi547 <234566161+WANG-Siqi547@users.noreply.github.com>
</commit_message>
<xml_diff>
--- a/FlowerNet_MSc_Project_Report.docx
+++ b/FlowerNet_MSc_Project_Report.docx
@@ -623,7 +623,15 @@
         <w:pStyle w:val="Heading1"/>
       </w:pPr>
       <w:r>
-        <w:t>7. flowernet-web: Gateway and Orchestration</w:t>
+        <w:t>7. Core Service Modules</w:t>
+      </w:r>
+    </w:p>
+    <w:p>
+      <w:pPr>
+        <w:pStyle w:val="Heading2"/>
+      </w:pPr>
+      <w:r>
+        <w:t>7.1 flowernet-web: Gateway and Orchestration</w:t>
       </w:r>
     </w:p>
     <w:p>
@@ -639,6 +647,121 @@
     <w:p>
       <w:r>
         <w:t>Additional gateway features include citation quality verification and domain filtering at the document level, ensuring that final outputs have a minimum number of high-quality sources. The service maintains internal caches of recent pipeline timings to calibrate timeouts and provides a metrics API for dashboards and external monitoring.</w:t>
+      </w:r>
+    </w:p>
+    <w:p>
+      <w:pPr>
+        <w:pStyle w:val="Heading2"/>
+      </w:pPr>
+      <w:r>
+        <w:t>7.2 flowernet-outliner: Structure Planning</w:t>
+      </w:r>
+    </w:p>
+    <w:p>
+      <w:r>
+        <w:t>The outliner service converts user requirements into a hierarchical outline and a set of content prompts. It implements a two-stage structure generation approach: first, it creates high-level section headings; second, it expands each section into detailed subsections. The prompts include contextual guidance for the generator and ensure that each subsection has a clear thematic scope.</w:t>
+      </w:r>
+    </w:p>
+    <w:p>
+      <w:r>
+        <w:t>The outliner supports a chain of LLM providers (SenseNova, Azure OpenAI, Gemini, DashScope, OpenRouter, and Ollama). Provider chaining is critical for resilience: if one provider fails or becomes rate-limited, the outliner can switch to the next. The service enforces cooldowns, backoff policies, and request pacing to prevent cascading failures.</w:t>
+      </w:r>
+    </w:p>
+    <w:p>
+      <w:r>
+        <w:t>Structured outputs are persisted in the history store, allowing the system to recover incomplete documents and to repeat generation deterministically. JSON sanitization and fallback routines are implemented to tolerate imperfect LLM outputs, ensuring that the system remains operational even when models produce malformed responses.</w:t>
+      </w:r>
+    </w:p>
+    <w:p>
+      <w:pPr>
+        <w:pStyle w:val="Heading2"/>
+      </w:pPr>
+      <w:r>
+        <w:t>7.3 flowernet-generator: Draft Generation and Orchestration</w:t>
+      </w:r>
+    </w:p>
+    <w:p>
+      <w:r>
+        <w:t>The generator is responsible for converting prompts into subsection drafts. It exposes APIs for simple draft generation as well as for full document orchestration. A key design choice is to inject a local generator instance into the orchestrator to avoid recursive HTTP calls that could deadlock. This reduces latency and isolates failures.</w:t>
+      </w:r>
+    </w:p>
+    <w:p>
+      <w:r>
+        <w:t>The generator uses a provider chain similar to the outliner. It detects transient errors, applies exponential backoff, and supports retry-after headers. Provider health is tracked with cooldown timers so that degraded endpoints are temporarily avoided. This design is essential for real-world usage where rate limits and intermittent network errors are common.</w:t>
+      </w:r>
+    </w:p>
+    <w:p>
+      <w:r>
+        <w:t>A crucial feature is the integration of the RAG pipeline. The generator constructs search queries from outlines and prompts, retrieves external sources, and inserts them into the prompt. The RAG process is tuned for academic sources and can enforce a minimum citation count, ensuring that each subsection includes grounded references.</w:t>
+      </w:r>
+    </w:p>
+    <w:p>
+      <w:pPr>
+        <w:pStyle w:val="Heading2"/>
+      </w:pPr>
+      <w:r>
+        <w:t>7.4 flowernet-verifier: Multi-Dimensional Quality Control</w:t>
+      </w:r>
+    </w:p>
+    <w:p>
+      <w:r>
+        <w:t>The verifier assesses each generated subsection using a layered quality model. Core metrics include relevance to the outline, redundancy against previous content, and multi-dimensional quality scores such as logical coherence, coverage completeness, and evidence grounding. These metrics are computed using a combination of lexical models (BM25, ROUGE-L) and semantic similarity models (Sentence-BERT or similar embeddings).</w:t>
+      </w:r>
+    </w:p>
+    <w:p>
+      <w:r>
+        <w:t>The verifier integrates citation drift detection. A configurable blacklist of cross-domain terms is applied to the titles and abstracts of retrieved sources. If a citation appears to be outside the expected domain, the verifier marks the subsection as failed and signals the controller to repair the prompt. This is a critical defense against RAG noise and hallucinated references.</w:t>
+      </w:r>
+    </w:p>
+    <w:p>
+      <w:r>
+        <w:t>When UniEval is available, the verifier delegates certain quality dimensions to an NLI-based scoring service. A dynamic timeout controller adapts to the observed latency of UniEval, preventing the verifier from stalling the entire pipeline. The verifier therefore operates in a graceful degradation mode, maintaining partial functionality if external scoring is unavailable.</w:t>
+      </w:r>
+    </w:p>
+    <w:p>
+      <w:pPr>
+        <w:pStyle w:val="Heading2"/>
+      </w:pPr>
+      <w:r>
+        <w:t>7.5 flowernet-controler: Prompt Repair and Contextual Bandit</w:t>
+      </w:r>
+    </w:p>
+    <w:p>
+      <w:r>
+        <w:t>The controller is responsible for correcting failed subsections. It analyses verifier feedback to identify failure dimensions and then selects an appropriate repair strategy. Strategies include rule-based outline adjustments, topic reinforcement, evidence amplification, and full LLM-based outline regeneration. Each strategy has distinct cost and effectiveness characteristics.</w:t>
+      </w:r>
+    </w:p>
+    <w:p>
+      <w:r>
+        <w:t>To manage strategy selection, the controller implements a contextual multi-armed bandit algorithm with UCB and ε-greedy exploration. The context includes failure dimensions, RAG quality, iteration counts, and provider status. Rewards are computed from improvements in relevance, reductions in redundancy, and the number of fixed quality dimensions. This turns prompt repair into a measurable learning problem rather than ad-hoc heuristics.</w:t>
+      </w:r>
+    </w:p>
+    <w:p>
+      <w:r>
+        <w:t>The controller logs each decision to a bandit event store. Offline policy evaluation scripts compute IPS, SNIPS, and Doubly Robust estimates to compare alternative strategies. This offline evaluation loop is a major differentiator: it provides empirical evidence for strategy effectiveness and enables policy updates without online risk.</w:t>
+      </w:r>
+    </w:p>
+    <w:p>
+      <w:pPr>
+        <w:pStyle w:val="Heading2"/>
+      </w:pPr>
+      <w:r>
+        <w:t>7.6 flowernet-unieval: NLI-based Quality Scoring</w:t>
+      </w:r>
+    </w:p>
+    <w:p>
+      <w:r>
+        <w:t>UniEval is an optional service that provides entailment-based scoring for quality dimensions. It loads a transformer model and computes entailment probabilities between the generated draft and the outline or history context. This yields more semantically grounded quality scores than lexical metrics alone, particularly for logical coherence and coverage completeness.</w:t>
+      </w:r>
+    </w:p>
+    <w:p>
+      <w:r>
+        <w:t>The service is engineered to be resilient to model download and initialization failures. It uses configurable retry budgets, cache directories, and an asynchronous warmup process. When operating in lightweight mode, the service exposes health endpoints without loading a model, allowing the rest of the pipeline to continue if compute resources are limited.</w:t>
+      </w:r>
+    </w:p>
+    <w:p>
+      <w:r>
+        <w:t>Integration with the verifier is controlled by timeout budgets that adapt to observed latency. This prevents the verification stage from becoming a bottleneck and ensures that the pipeline can still complete within user-specified deadlines.</w:t>
       </w:r>
     </w:p>
     <w:p>
@@ -646,22 +769,22 @@
         <w:pStyle w:val="Heading1"/>
       </w:pPr>
       <w:r>
-        <w:t>8. flowernet-outliner: Structure Planning</w:t>
-      </w:r>
-    </w:p>
-    <w:p>
-      <w:r>
-        <w:t>The outliner service converts user requirements into a hierarchical outline and a set of content prompts. It implements a two-stage structure generation approach: first, it creates high-level section headings; second, it expands each section into detailed subsections. The prompts include contextual guidance for the generator and ensure that each subsection has a clear thematic scope.</w:t>
-      </w:r>
-    </w:p>
-    <w:p>
-      <w:r>
-        <w:t>The outliner supports a chain of LLM providers (SenseNova, Azure OpenAI, Gemini, DashScope, OpenRouter, and Ollama). Provider chaining is critical for resilience: if one provider fails or becomes rate-limited, the outliner can switch to the next. The service enforces cooldowns, backoff policies, and request pacing to prevent cascading failures.</w:t>
-      </w:r>
-    </w:p>
-    <w:p>
-      <w:r>
-        <w:t>Structured outputs are persisted in the history store, allowing the system to recover incomplete documents and to repeat generation deterministically. JSON sanitization and fallback routines are implemented to tolerate imperfect LLM outputs, ensuring that the system remains operational even when models produce malformed responses.</w:t>
+        <w:t>8. History Store and State Management</w:t>
+      </w:r>
+    </w:p>
+    <w:p>
+      <w:r>
+        <w:t>The history store provides persistent state across the pipeline. It supports both in-memory and SQLite-backed storage modes. The database schema includes tables for generated content, outlines, subsection tracking, passed history, and progress events. This design enables a complete audit trail from initial outline to final document.</w:t>
+      </w:r>
+    </w:p>
+    <w:p>
+      <w:r>
+        <w:t>Subsection tracking records the outline, generated content, verification scores, and iteration counts. This makes it possible to analyze why specific subsections fail and how many repair cycles were needed. Progress events provide a chronological log used by the web interface to visualize pipeline progress and to support recovery from partial failures.</w:t>
+      </w:r>
+    </w:p>
+    <w:p>
+      <w:r>
+        <w:t>By centralizing state management, FlowerNet can resume incomplete documents and can support consistent context retrieval even when services are scaled horizontally. This is particularly important for real-world deployments where tasks may be long-running and susceptible to network interruptions.</w:t>
       </w:r>
     </w:p>
     <w:p>
@@ -669,22 +792,22 @@
         <w:pStyle w:val="Heading1"/>
       </w:pPr>
       <w:r>
-        <w:t>9. flowernet-generator: Draft Generation and Orchestration</w:t>
-      </w:r>
-    </w:p>
-    <w:p>
-      <w:r>
-        <w:t>The generator is responsible for converting prompts into subsection drafts. It exposes APIs for simple draft generation as well as for full document orchestration. A key design choice is to inject a local generator instance into the orchestrator to avoid recursive HTTP calls that could deadlock. This reduces latency and isolates failures.</w:t>
-      </w:r>
-    </w:p>
-    <w:p>
-      <w:r>
-        <w:t>The generator uses a provider chain similar to the outliner. It detects transient errors, applies exponential backoff, and supports retry-after headers. Provider health is tracked with cooldown timers so that degraded endpoints are temporarily avoided. This design is essential for real-world usage where rate limits and intermittent network errors are common.</w:t>
-      </w:r>
-    </w:p>
-    <w:p>
-      <w:r>
-        <w:t>A crucial feature is the integration of the RAG pipeline. The generator constructs search queries from outlines and prompts, retrieves external sources, and inserts them into the prompt. The RAG process is tuned for academic sources and can enforce a minimum citation count, ensuring that each subsection includes grounded references.</w:t>
+        <w:t>9. Retrieval-Augmented Generation and Citation Pipeline</w:t>
+      </w:r>
+    </w:p>
+    <w:p>
+      <w:r>
+        <w:t>FlowerNet employs a retrieval-augmented generation pipeline to ground drafts in external sources. The RAG search engine constructs multiple query candidates, filters stopwords, and prioritizes academic domains such as arXiv, Crossref, IEEE, and institutional repositories. This design improves the quality of citations and reduces reliance on low-quality web content.</w:t>
+      </w:r>
+    </w:p>
+    <w:p>
+      <w:r>
+        <w:t>The pipeline ranks retrieved sources and injects them into the generation prompt. A minimum citation count can be enforced, and the system tracks high- and low-quality domains for quality metrics. This creates a measurable link between retrieval quality and overall document quality.</w:t>
+      </w:r>
+    </w:p>
+    <w:p>
+      <w:r>
+        <w:t>A three-stage citation quality defense further improves reliability: (1) domain anchoring in query construction; (2) an evidence-check workflow embedded in the LLM prompt; and (3) blacklist detection in the verifier. Together, these layers dramatically reduce cross-domain citation drift, a known failure mode of RAG-based systems.</w:t>
       </w:r>
     </w:p>
     <w:p>
@@ -692,22 +815,22 @@
         <w:pStyle w:val="Heading1"/>
       </w:pPr>
       <w:r>
-        <w:t>10. flowernet-verifier: Multi-Dimensional Quality Control</w:t>
-      </w:r>
-    </w:p>
-    <w:p>
-      <w:r>
-        <w:t>The verifier assesses each generated subsection using a layered quality model. Core metrics include relevance to the outline, redundancy against previous content, and multi-dimensional quality scores such as logical coherence, coverage completeness, and evidence grounding. These metrics are computed using a combination of lexical models (BM25, ROUGE-L) and semantic similarity models (Sentence-BERT or similar embeddings).</w:t>
-      </w:r>
-    </w:p>
-    <w:p>
-      <w:r>
-        <w:t>The verifier integrates citation drift detection. A configurable blacklist of cross-domain terms is applied to the titles and abstracts of retrieved sources. If a citation appears to be outside the expected domain, the verifier marks the subsection as failed and signals the controller to repair the prompt. This is a critical defense against RAG noise and hallucinated references.</w:t>
-      </w:r>
-    </w:p>
-    <w:p>
-      <w:r>
-        <w:t>When UniEval is available, the verifier delegates certain quality dimensions to an NLI-based scoring service. A dynamic timeout controller adapts to the observed latency of UniEval, preventing the verifier from stalling the entire pipeline. The verifier therefore operates in a graceful degradation mode, maintaining partial functionality if external scoring is unavailable.</w:t>
+        <w:t>10. Domain Filtering and Citation Verification</w:t>
+      </w:r>
+    </w:p>
+    <w:p>
+      <w:r>
+        <w:t>Domain filtering is implemented through an index-term extraction mechanism and a similarity scorer. The system extracts key terms from document titles, outlines, and content samples, then compares them to citation abstracts using a sentence-transformer model. If semantic similarity falls below a configurable threshold, the citation is discarded.</w:t>
+      </w:r>
+    </w:p>
+    <w:p>
+      <w:r>
+        <w:t>The citation verifier extends this logic by introducing a domain classifier and cross-domain risk estimation. It uses keyword and semantic overlap to compute a composite relevance score, penalizing references that contain evidence of domain mismatch. This process ensures that citations used in a negotiation report are not accidentally drawn from physics or unrelated disciplines.</w:t>
+      </w:r>
+    </w:p>
+    <w:p>
+      <w:r>
+        <w:t>The verifier’s decision is explained with explicit reasons, enabling interpretability. This transparency is critical for academic use, where citations must be defensible. The filtering process therefore contributes not only to accuracy but also to trustworthiness of the generated document.</w:t>
       </w:r>
     </w:p>
     <w:p>
@@ -715,122 +838,7 @@
         <w:pStyle w:val="Heading1"/>
       </w:pPr>
       <w:r>
-        <w:t>11. flowernet-controler: Prompt Repair and Contextual Bandit</w:t>
-      </w:r>
-    </w:p>
-    <w:p>
-      <w:r>
-        <w:t>The controller is responsible for correcting failed subsections. It analyses verifier feedback to identify failure dimensions and then selects an appropriate repair strategy. Strategies include rule-based outline adjustments, topic reinforcement, evidence amplification, and full LLM-based outline regeneration. Each strategy has distinct cost and effectiveness characteristics.</w:t>
-      </w:r>
-    </w:p>
-    <w:p>
-      <w:r>
-        <w:t>To manage strategy selection, the controller implements a contextual multi-armed bandit algorithm with UCB and ε-greedy exploration. The context includes failure dimensions, RAG quality, iteration counts, and provider status. Rewards are computed from improvements in relevance, reductions in redundancy, and the number of fixed quality dimensions. This turns prompt repair into a measurable learning problem rather than ad-hoc heuristics.</w:t>
-      </w:r>
-    </w:p>
-    <w:p>
-      <w:r>
-        <w:t>The controller logs each decision to a bandit event store. Offline policy evaluation scripts compute IPS, SNIPS, and Doubly Robust estimates to compare alternative strategies. This offline evaluation loop is a major differentiator: it provides empirical evidence for strategy effectiveness and enables policy updates without online risk.</w:t>
-      </w:r>
-    </w:p>
-    <w:p>
-      <w:pPr>
-        <w:pStyle w:val="Heading1"/>
-      </w:pPr>
-      <w:r>
-        <w:t>12. flowernet-unieval: NLI-based Quality Scoring</w:t>
-      </w:r>
-    </w:p>
-    <w:p>
-      <w:r>
-        <w:t>UniEval is an optional service that provides entailment-based scoring for quality dimensions. It loads a transformer model and computes entailment probabilities between the generated draft and the outline or history context. This yields more semantically grounded quality scores than lexical metrics alone, particularly for logical coherence and coverage completeness.</w:t>
-      </w:r>
-    </w:p>
-    <w:p>
-      <w:r>
-        <w:t>The service is engineered to be resilient to model download and initialization failures. It uses configurable retry budgets, cache directories, and an asynchronous warmup process. When operating in lightweight mode, the service exposes health endpoints without loading a model, allowing the rest of the pipeline to continue if compute resources are limited.</w:t>
-      </w:r>
-    </w:p>
-    <w:p>
-      <w:r>
-        <w:t>Integration with the verifier is controlled by timeout budgets that adapt to observed latency. This prevents the verification stage from becoming a bottleneck and ensures that the pipeline can still complete within user-specified deadlines.</w:t>
-      </w:r>
-    </w:p>
-    <w:p>
-      <w:pPr>
-        <w:pStyle w:val="Heading1"/>
-      </w:pPr>
-      <w:r>
-        <w:t>13. History Store and State Management</w:t>
-      </w:r>
-    </w:p>
-    <w:p>
-      <w:r>
-        <w:t>The history store provides persistent state across the pipeline. It supports both in-memory and SQLite-backed storage modes. The database schema includes tables for generated content, outlines, subsection tracking, passed history, and progress events. This design enables a complete audit trail from initial outline to final document.</w:t>
-      </w:r>
-    </w:p>
-    <w:p>
-      <w:r>
-        <w:t>Subsection tracking records the outline, generated content, verification scores, and iteration counts. This makes it possible to analyze why specific subsections fail and how many repair cycles were needed. Progress events provide a chronological log used by the web interface to visualize pipeline progress and to support recovery from partial failures.</w:t>
-      </w:r>
-    </w:p>
-    <w:p>
-      <w:r>
-        <w:t>By centralizing state management, FlowerNet can resume incomplete documents and can support consistent context retrieval even when services are scaled horizontally. This is particularly important for real-world deployments where tasks may be long-running and susceptible to network interruptions.</w:t>
-      </w:r>
-    </w:p>
-    <w:p>
-      <w:pPr>
-        <w:pStyle w:val="Heading1"/>
-      </w:pPr>
-      <w:r>
-        <w:t>14. Retrieval-Augmented Generation and Citation Pipeline</w:t>
-      </w:r>
-    </w:p>
-    <w:p>
-      <w:r>
-        <w:t>FlowerNet employs a retrieval-augmented generation pipeline to ground drafts in external sources. The RAG search engine constructs multiple query candidates, filters stopwords, and prioritizes academic domains such as arXiv, Crossref, IEEE, and institutional repositories. This design improves the quality of citations and reduces reliance on low-quality web content.</w:t>
-      </w:r>
-    </w:p>
-    <w:p>
-      <w:r>
-        <w:t>The pipeline ranks retrieved sources and injects them into the generation prompt. A minimum citation count can be enforced, and the system tracks high- and low-quality domains for quality metrics. This creates a measurable link between retrieval quality and overall document quality.</w:t>
-      </w:r>
-    </w:p>
-    <w:p>
-      <w:r>
-        <w:t>A three-stage citation quality defense further improves reliability: (1) domain anchoring in query construction; (2) an evidence-check workflow embedded in the LLM prompt; and (3) blacklist detection in the verifier. Together, these layers dramatically reduce cross-domain citation drift, a known failure mode of RAG-based systems.</w:t>
-      </w:r>
-    </w:p>
-    <w:p>
-      <w:pPr>
-        <w:pStyle w:val="Heading1"/>
-      </w:pPr>
-      <w:r>
-        <w:t>15. Domain Filtering and Citation Verification</w:t>
-      </w:r>
-    </w:p>
-    <w:p>
-      <w:r>
-        <w:t>Domain filtering is implemented through an index-term extraction mechanism and a similarity scorer. The system extracts key terms from document titles, outlines, and content samples, then compares them to citation abstracts using a sentence-transformer model. If semantic similarity falls below a configurable threshold, the citation is discarded.</w:t>
-      </w:r>
-    </w:p>
-    <w:p>
-      <w:r>
-        <w:t>The citation verifier extends this logic by introducing a domain classifier and cross-domain risk estimation. It uses keyword and semantic overlap to compute a composite relevance score, penalizing references that contain evidence of domain mismatch. This process ensures that citations used in a negotiation report are not accidentally drawn from physics or unrelated disciplines.</w:t>
-      </w:r>
-    </w:p>
-    <w:p>
-      <w:r>
-        <w:t>The verifier’s decision is explained with explicit reasons, enabling interpretability. This transparency is critical for academic use, where citations must be defensible. The filtering process therefore contributes not only to accuracy but also to trustworthiness of the generated document.</w:t>
-      </w:r>
-    </w:p>
-    <w:p>
-      <w:pPr>
-        <w:pStyle w:val="Heading1"/>
-      </w:pPr>
-      <w:r>
-        <w:t>16. Quality Metrics and Dashboard API</w:t>
+        <w:t>11. Quality Metrics and Dashboard API</w:t>
       </w:r>
     </w:p>
     <w:p>
@@ -1174,7 +1182,7 @@
         <w:pStyle w:val="Heading1"/>
       </w:pPr>
       <w:r>
-        <w:t>17. Stability, Reliability, and Failure Recovery</w:t>
+        <w:t>12. Stability, Reliability, and Failure Recovery</w:t>
       </w:r>
     </w:p>
     <w:p>
@@ -1197,7 +1205,7 @@
         <w:pStyle w:val="Heading1"/>
       </w:pPr>
       <w:r>
-        <w:t>18. Deployment and Configuration</w:t>
+        <w:t>13. Deployment and Configuration</w:t>
       </w:r>
     </w:p>
     <w:p>
@@ -1292,7 +1300,7 @@
         <w:pStyle w:val="Heading1"/>
       </w:pPr>
       <w:r>
-        <w:t>19. Evaluation and Testing</w:t>
+        <w:t>14. Evaluation and Testing</w:t>
       </w:r>
     </w:p>
     <w:p>
@@ -1315,7 +1323,7 @@
         <w:pStyle w:val="Heading1"/>
       </w:pPr>
       <w:r>
-        <w:t>20. System Complexity and Distinguishing Features</w:t>
+        <w:t>15. System Complexity and Distinguishing Features</w:t>
       </w:r>
     </w:p>
     <w:p>
@@ -1338,7 +1346,7 @@
         <w:pStyle w:val="Heading1"/>
       </w:pPr>
       <w:r>
-        <w:t>21. Limitations and Future Work</w:t>
+        <w:t>16. Limitations and Future Work</w:t>
       </w:r>
     </w:p>
     <w:p>
@@ -1361,7 +1369,7 @@
         <w:pStyle w:val="Heading1"/>
       </w:pPr>
       <w:r>
-        <w:t>22. Conclusion</w:t>
+        <w:t>17. Conclusion</w:t>
       </w:r>
     </w:p>
     <w:p>
@@ -1457,7 +1465,7 @@
         <w:pStyle w:val="Heading1"/>
       </w:pPr>
       <w:r>
-        <w:t>23. Related Work and Theoretical Foundations</w:t>
+        <w:t>18. Related Work and Theoretical Foundations</w:t>
       </w:r>
     </w:p>
     <w:p>
@@ -1485,7 +1493,7 @@
         <w:pStyle w:val="Heading1"/>
       </w:pPr>
       <w:r>
-        <w:t>24. Requirements Analysis and Quality Targets</w:t>
+        <w:t>19. Requirements Analysis and Quality Targets</w:t>
       </w:r>
     </w:p>
     <w:p>
@@ -1511,6 +1519,14 @@
     <w:p>
       <w:pPr>
         <w:pStyle w:val="Heading1"/>
+      </w:pPr>
+      <w:r>
+        <w:t>Appendices</w:t>
+      </w:r>
+    </w:p>
+    <w:p>
+      <w:pPr>
+        <w:pStyle w:val="Heading2"/>
       </w:pPr>
       <w:r>
         <w:t>Appendix A. API Contracts and Payload Examples</w:t>
@@ -2219,7 +2235,7 @@
     </w:p>
     <w:p>
       <w:pPr>
-        <w:pStyle w:val="Heading1"/>
+        <w:pStyle w:val="Heading2"/>
       </w:pPr>
       <w:r>
         <w:t>Appendix B. Data Schema and Persistence Model</w:t>
@@ -2751,7 +2767,7 @@
     </w:p>
     <w:p>
       <w:pPr>
-        <w:pStyle w:val="Heading1"/>
+        <w:pStyle w:val="Heading2"/>
       </w:pPr>
       <w:r>
         <w:t>Appendix C. Configuration Matrix</w:t>
@@ -3480,7 +3496,7 @@
     </w:tbl>
     <w:p>
       <w:pPr>
-        <w:pStyle w:val="Heading1"/>
+        <w:pStyle w:val="Heading2"/>
       </w:pPr>
       <w:r>
         <w:t>Appendix D. Algorithm Walkthrough and Pseudocode</w:t>
@@ -3746,7 +3762,7 @@
     </w:p>
     <w:p>
       <w:pPr>
-        <w:pStyle w:val="Heading1"/>
+        <w:pStyle w:val="Heading2"/>
       </w:pPr>
       <w:r>
         <w:t>Appendix E. Operational Scenario Walkthrough</w:t>
@@ -3770,6 +3786,19 @@
     <w:p>
       <w:r>
         <w:br w:type="page"/>
+      </w:r>
+    </w:p>
+    <w:p>
+      <w:pPr>
+        <w:pStyle w:val="Heading2"/>
+      </w:pPr>
+      <w:r>
+        <w:t>Appendix F. Detailed Module Walkthrough</w:t>
+      </w:r>
+    </w:p>
+    <w:p>
+      <w:r>
+        <w:t>This appendix provides a deeper narrative walkthrough of each service, expanding on the architectural overview. The intention is to show how each module behaves internally, which data it consumes, and how it contributes to the overall closed-loop pipeline. These narratives mirror the actual control flow implemented in the repository, including the retry and timeout mechanisms that are critical for robustness.</w:t>
       </w:r>
     </w:p>
     <w:p>
@@ -3777,12 +3806,22 @@
         <w:pStyle w:val="Heading1"/>
       </w:pPr>
       <w:r>
-        <w:t>Appendix F. Detailed Module Walkthrough</w:t>
-      </w:r>
-    </w:p>
-    <w:p>
-      <w:r>
-        <w:t>This appendix provides a deeper narrative walkthrough of each service, expanding on the architectural overview. The intention is to show how each module behaves internally, which data it consumes, and how it contributes to the overall closed-loop pipeline. These narratives mirror the actual control flow implemented in the repository, including the retry and timeout mechanisms that are critical for robustness.</w:t>
+        <w:t>flowernet-web deep dive</w:t>
+      </w:r>
+    </w:p>
+    <w:p>
+      <w:r>
+        <w:t>The gateway is the primary entry point for users and clients. It validates input parameters, calculates adaptive timeouts, and assigns a unique document identifier. It then orchestrates the downstream services by calling the outliner to generate structure and the generator to initiate subsection-level loops. It also maintains a rate-limiting guard, ensuring that clients cannot overload the system with repeated requests.</w:t>
+      </w:r>
+    </w:p>
+    <w:p>
+      <w:r>
+        <w:t>Internally, the gateway maintains rolling latency statistics to estimate how long each pipeline stage might take. These statistics influence the time budget allocated to each downstream call. The gateway also aggregates metrics from the generator and verifier, such as average iteration counts and pass rates, and exposes them via a metrics API. This makes the system observable and allows researchers to understand how quality evolves during execution.</w:t>
+      </w:r>
+    </w:p>
+    <w:p>
+      <w:r>
+        <w:t>The gateway is responsible for document assembly and output formatting. It merges subsection outputs into a coherent Markdown structure and optionally converts to DOCX. During assembly, it can invoke citation verification and domain filtering to ensure that the final document meets citation quality requirements. The result is a single response that contains both content and a rich diagnostic payload.</w:t>
       </w:r>
     </w:p>
     <w:p>
@@ -3790,22 +3829,22 @@
         <w:pStyle w:val="Heading1"/>
       </w:pPr>
       <w:r>
-        <w:t>flowernet-web deep dive</w:t>
-      </w:r>
-    </w:p>
-    <w:p>
-      <w:r>
-        <w:t>The gateway is the primary entry point for users and clients. It validates input parameters, calculates adaptive timeouts, and assigns a unique document identifier. It then orchestrates the downstream services by calling the outliner to generate structure and the generator to initiate subsection-level loops. It also maintains a rate-limiting guard, ensuring that clients cannot overload the system with repeated requests.</w:t>
-      </w:r>
-    </w:p>
-    <w:p>
-      <w:r>
-        <w:t>Internally, the gateway maintains rolling latency statistics to estimate how long each pipeline stage might take. These statistics influence the time budget allocated to each downstream call. The gateway also aggregates metrics from the generator and verifier, such as average iteration counts and pass rates, and exposes them via a metrics API. This makes the system observable and allows researchers to understand how quality evolves during execution.</w:t>
-      </w:r>
-    </w:p>
-    <w:p>
-      <w:r>
-        <w:t>The gateway is responsible for document assembly and output formatting. It merges subsection outputs into a coherent Markdown structure and optionally converts to DOCX. During assembly, it can invoke citation verification and domain filtering to ensure that the final document meets citation quality requirements. The result is a single response that contains both content and a rich diagnostic payload.</w:t>
+        <w:t>flowernet-outliner deep dive</w:t>
+      </w:r>
+    </w:p>
+    <w:p>
+      <w:r>
+        <w:t>The outliner service transforms user requirements into a hierarchical outline and prompt set. It first generates a document-level plan, then expands each section into subsections. It uses provider chaining to improve reliability: if the first provider fails, the outliner falls back to the next provider in the chain. This mechanism is crucial for long-running workloads and ensures that outline generation can complete even under provider instability.</w:t>
+      </w:r>
+    </w:p>
+    <w:p>
+      <w:r>
+        <w:t>To maintain data integrity, the outliner sanitizes JSON outputs from the LLM. It removes formatting artifacts, applies fallback parsing strategies, and can synthesize a default outline if the model fails to return valid JSON. This defensive parsing ensures that downstream modules always receive a usable structure and do not fail due to malformed outputs.</w:t>
+      </w:r>
+    </w:p>
+    <w:p>
+      <w:r>
+        <w:t>The outliner stores every outline and prompt in the shared history store. This enables complete recovery of the document structure and allows the generator to resume after interruptions. It also allows researchers to analyze how outlines influence final quality metrics, enabling future tuning of the outline generation prompts.</w:t>
       </w:r>
     </w:p>
     <w:p>
@@ -3813,22 +3852,22 @@
         <w:pStyle w:val="Heading1"/>
       </w:pPr>
       <w:r>
-        <w:t>flowernet-outliner deep dive</w:t>
-      </w:r>
-    </w:p>
-    <w:p>
-      <w:r>
-        <w:t>The outliner service transforms user requirements into a hierarchical outline and prompt set. It first generates a document-level plan, then expands each section into subsections. It uses provider chaining to improve reliability: if the first provider fails, the outliner falls back to the next provider in the chain. This mechanism is crucial for long-running workloads and ensures that outline generation can complete even under provider instability.</w:t>
-      </w:r>
-    </w:p>
-    <w:p>
-      <w:r>
-        <w:t>To maintain data integrity, the outliner sanitizes JSON outputs from the LLM. It removes formatting artifacts, applies fallback parsing strategies, and can synthesize a default outline if the model fails to return valid JSON. This defensive parsing ensures that downstream modules always receive a usable structure and do not fail due to malformed outputs.</w:t>
-      </w:r>
-    </w:p>
-    <w:p>
-      <w:r>
-        <w:t>The outliner stores every outline and prompt in the shared history store. This enables complete recovery of the document structure and allows the generator to resume after interruptions. It also allows researchers to analyze how outlines influence final quality metrics, enabling future tuning of the outline generation prompts.</w:t>
+        <w:t>flowernet-generator deep dive</w:t>
+      </w:r>
+    </w:p>
+    <w:p>
+      <w:r>
+        <w:t>The generator translates subsection prompts into drafts. It builds prompts that combine the subsection outline, recent history, and retrieval context. This ensures that each draft is grounded in both the required structure and the existing document context. The generator can operate locally or via HTTP depending on deployment, and it uses the same provider chain logic as the outliner to maximize availability.</w:t>
+      </w:r>
+    </w:p>
+    <w:p>
+      <w:r>
+        <w:t>One of the generator’s most critical responsibilities is the integration of retrieval-augmented generation. It calls the RAG search engine, ranks retrieved sources, and embeds citations into the prompt. It can enforce a minimum citation count to prevent ungrounded content. The generator also applies a three-stage citation quality scheme, ensuring that retrieval, prompting, and verification all enforce domain consistency.</w:t>
+      </w:r>
+    </w:p>
+    <w:p>
+      <w:r>
+        <w:t>When the verifier rejects a draft, the generator relies on the controller to supply a repaired prompt. It then restarts the generation process for the same subsection. This iterative loop is carefully bounded by maximum attempts and time budgets to prevent runaway latency. Each attempt is recorded in the history store, enabling offline analysis of convergence speed.</w:t>
       </w:r>
     </w:p>
     <w:p>
@@ -3836,22 +3875,22 @@
         <w:pStyle w:val="Heading1"/>
       </w:pPr>
       <w:r>
-        <w:t>flowernet-generator deep dive</w:t>
-      </w:r>
-    </w:p>
-    <w:p>
-      <w:r>
-        <w:t>The generator translates subsection prompts into drafts. It builds prompts that combine the subsection outline, recent history, and retrieval context. This ensures that each draft is grounded in both the required structure and the existing document context. The generator can operate locally or via HTTP depending on deployment, and it uses the same provider chain logic as the outliner to maximize availability.</w:t>
-      </w:r>
-    </w:p>
-    <w:p>
-      <w:r>
-        <w:t>One of the generator’s most critical responsibilities is the integration of retrieval-augmented generation. It calls the RAG search engine, ranks retrieved sources, and embeds citations into the prompt. It can enforce a minimum citation count to prevent ungrounded content. The generator also applies a three-stage citation quality scheme, ensuring that retrieval, prompting, and verification all enforce domain consistency.</w:t>
-      </w:r>
-    </w:p>
-    <w:p>
-      <w:r>
-        <w:t>When the verifier rejects a draft, the generator relies on the controller to supply a repaired prompt. It then restarts the generation process for the same subsection. This iterative loop is carefully bounded by maximum attempts and time budgets to prevent runaway latency. Each attempt is recorded in the history store, enabling offline analysis of convergence speed.</w:t>
+        <w:t>flowernet-verifier deep dive</w:t>
+      </w:r>
+    </w:p>
+    <w:p>
+      <w:r>
+        <w:t>The verifier computes quality metrics for each draft. It performs relevance scoring using lexical similarity, redundancy analysis against history, and multi-dimensional quality scoring. It can optionally query the UniEval service for NLI-based scores that capture entailment and logical coherence. The verifier also calculates uncertainty metrics to quantify confidence.</w:t>
+      </w:r>
+    </w:p>
+    <w:p>
+      <w:r>
+        <w:t>Citation drift detection is implemented as a separate subroutine within the verifier. It inspects citation titles and abstracts for cross-domain terms and triggers a failure if misalignment is detected. This behavior is critical because it gives the controller a signal to regenerate the subsection with stricter constraints. The verifier therefore serves as a gatekeeper for both textual quality and citation integrity.</w:t>
+      </w:r>
+    </w:p>
+    <w:p>
+      <w:r>
+        <w:t>The verifier is designed for graceful degradation. If the semantic model is unavailable or the UniEval service is slow, the verifier falls back to lightweight heuristics. This ensures that the pipeline can still complete under constrained resources while providing a clear signal about which metrics are approximate and which are robust.</w:t>
       </w:r>
     </w:p>
     <w:p>
@@ -3859,22 +3898,22 @@
         <w:pStyle w:val="Heading1"/>
       </w:pPr>
       <w:r>
-        <w:t>flowernet-verifier deep dive</w:t>
-      </w:r>
-    </w:p>
-    <w:p>
-      <w:r>
-        <w:t>The verifier computes quality metrics for each draft. It performs relevance scoring using lexical similarity, redundancy analysis against history, and multi-dimensional quality scoring. It can optionally query the UniEval service for NLI-based scores that capture entailment and logical coherence. The verifier also calculates uncertainty metrics to quantify confidence.</w:t>
-      </w:r>
-    </w:p>
-    <w:p>
-      <w:r>
-        <w:t>Citation drift detection is implemented as a separate subroutine within the verifier. It inspects citation titles and abstracts for cross-domain terms and triggers a failure if misalignment is detected. This behavior is critical because it gives the controller a signal to regenerate the subsection with stricter constraints. The verifier therefore serves as a gatekeeper for both textual quality and citation integrity.</w:t>
-      </w:r>
-    </w:p>
-    <w:p>
-      <w:r>
-        <w:t>The verifier is designed for graceful degradation. If the semantic model is unavailable or the UniEval service is slow, the verifier falls back to lightweight heuristics. This ensures that the pipeline can still complete under constrained resources while providing a clear signal about which metrics are approximate and which are robust.</w:t>
+        <w:t>flowernet-controler deep dive</w:t>
+      </w:r>
+    </w:p>
+    <w:p>
+      <w:r>
+        <w:t>The controller is the decision engine for repair strategies. It consumes verifier feedback and selects a repair approach that targets the specific failure dimensions. For example, if topic alignment is low, the controller emphasizes topic-specific constraints; if redundancy is high, it injects instructions to avoid repetition and generate novel perspectives.</w:t>
+      </w:r>
+    </w:p>
+    <w:p>
+      <w:r>
+        <w:t>The controller’s contextual bandit mechanism treats each repair strategy as an arm. It evaluates expected rewards based on context features such as failure type, iteration count, and RAG quality. The bandit balances exploration and exploitation, ensuring that the system can discover better strategies over time while still leveraging known effective repairs.</w:t>
+      </w:r>
+    </w:p>
+    <w:p>
+      <w:r>
+        <w:t>All controller decisions are logged in event files that capture context, selected strategy, and reward outcomes. Offline policy evaluation scripts compute IPS, SNIPS, and doubly robust estimates to assess alternative strategies. This creates a feedback loop for continuous improvement and distinguishes the controller from static rule-based systems.</w:t>
       </w:r>
     </w:p>
     <w:p>
@@ -3882,250 +3921,227 @@
         <w:pStyle w:val="Heading1"/>
       </w:pPr>
       <w:r>
-        <w:t>flowernet-controler deep dive</w:t>
-      </w:r>
-    </w:p>
-    <w:p>
-      <w:r>
-        <w:t>The controller is the decision engine for repair strategies. It consumes verifier feedback and selects a repair approach that targets the specific failure dimensions. For example, if topic alignment is low, the controller emphasizes topic-specific constraints; if redundancy is high, it injects instructions to avoid repetition and generate novel perspectives.</w:t>
-      </w:r>
-    </w:p>
-    <w:p>
-      <w:r>
-        <w:t>The controller’s contextual bandit mechanism treats each repair strategy as an arm. It evaluates expected rewards based on context features such as failure type, iteration count, and RAG quality. The bandit balances exploration and exploitation, ensuring that the system can discover better strategies over time while still leveraging known effective repairs.</w:t>
-      </w:r>
-    </w:p>
-    <w:p>
-      <w:r>
-        <w:t>All controller decisions are logged in event files that capture context, selected strategy, and reward outcomes. Offline policy evaluation scripts compute IPS, SNIPS, and doubly robust estimates to assess alternative strategies. This creates a feedback loop for continuous improvement and distinguishes the controller from static rule-based systems.</w:t>
+        <w:t>flowernet-unieval deep dive</w:t>
+      </w:r>
+    </w:p>
+    <w:p>
+      <w:r>
+        <w:t>The UniEval service provides entailment-based semantic scoring for quality dimensions that are difficult to capture with lexical metrics alone. It uses a cross-encoder NLI model to compute entailment probabilities between the draft and the outline. This helps identify logical gaps and mismatches between intended and produced content.</w:t>
+      </w:r>
+    </w:p>
+    <w:p>
+      <w:r>
+        <w:t>The service includes a robust initialization workflow with retries, cache support, and asynchronous warmup. This avoids blocking the pipeline during model download and ensures that the system can continue to operate even if the UniEval model is unavailable. It also exposes readiness and liveness endpoints for orchestration systems.</w:t>
+      </w:r>
+    </w:p>
+    <w:p>
+      <w:r>
+        <w:t>The verifier integrates UniEval with adaptive timeouts. If UniEval is slow or not ready, the verifier switches to heuristic scoring, ensuring a bounded response time. This design acknowledges that semantic scoring is valuable but cannot compromise system availability.</w:t>
       </w:r>
     </w:p>
     <w:p>
       <w:pPr>
-        <w:pStyle w:val="Heading1"/>
+        <w:pStyle w:val="Heading2"/>
       </w:pPr>
       <w:r>
-        <w:t>flowernet-unieval deep dive</w:t>
-      </w:r>
-    </w:p>
-    <w:p>
-      <w:r>
-        <w:t>The UniEval service provides entailment-based semantic scoring for quality dimensions that are difficult to capture with lexical metrics alone. It uses a cross-encoder NLI model to compute entailment probabilities between the draft and the outline. This helps identify logical gaps and mismatches between intended and produced content.</w:t>
-      </w:r>
-    </w:p>
-    <w:p>
-      <w:r>
-        <w:t>The service includes a robust initialization workflow with retries, cache support, and asynchronous warmup. This avoids blocking the pipeline during model download and ensures that the system can continue to operate even if the UniEval model is unavailable. It also exposes readiness and liveness endpoints for orchestration systems.</w:t>
-      </w:r>
-    </w:p>
-    <w:p>
-      <w:r>
-        <w:t>The verifier integrates UniEval with adaptive timeouts. If UniEval is slow or not ready, the verifier switches to heuristic scoring, ensuring a bounded response time. This design acknowledges that semantic scoring is valuable but cannot compromise system availability.</w:t>
+        <w:t>Appendix G. Metrics Catalogue and Interpretation</w:t>
+      </w:r>
+    </w:p>
+    <w:p>
+      <w:r>
+        <w:t>The following catalogue lists the primary metrics tracked by FlowerNet. Each metric contributes to the overall quality gate and is used by the controller and gateway to decide whether outputs meet academic standards. The descriptions emphasize the semantic meaning of each metric and how it influences the closed-loop pipeline.</w:t>
+      </w:r>
+    </w:p>
+    <w:p>
+      <w:r>
+        <w:t>Relevancy index: Measures semantic alignment between the generated subsection and the outline prompt. High relevance indicates that the text stays on topic and does not drift into unrelated content. This metric is computed using a combination of lexical overlap and semantic similarity scores.</w:t>
+      </w:r>
+    </w:p>
+    <w:p>
+      <w:r>
+        <w:t>Redundancy index: Quantifies overlap between the current subsection and historical content. A high redundancy score indicates that the subsection repeats prior information. The controller uses this metric to enforce novelty and to introduce fresh perspectives in subsequent iterations.</w:t>
+      </w:r>
+    </w:p>
+    <w:p>
+      <w:r>
+        <w:t>Topic alignment: Evaluates whether the subsection explicitly addresses the core topic of the outline. It is a stricter version of relevance that penalizes generic explanations and rewards direct engagement with the target concept.</w:t>
+      </w:r>
+    </w:p>
+    <w:p>
+      <w:r>
+        <w:t>Coverage completeness: Estimates how many of the outline’s key points appear in the subsection. This metric is essential for ensuring that the subsection does not omit required subtopics.</w:t>
+      </w:r>
+    </w:p>
+    <w:p>
+      <w:r>
+        <w:t>Logical coherence: Detects gaps in reasoning and evaluates the flow between sentences. Low coherence suggests missing transitions or invalid logical steps, prompting the controller to enforce stronger structure.</w:t>
+      </w:r>
+    </w:p>
+    <w:p>
+      <w:r>
+        <w:t>Evidence grounding: Measures the presence and density of citations, data, or concrete examples. High scores indicate that claims are supported by external evidence rather than generic statements.</w:t>
+      </w:r>
+    </w:p>
+    <w:p>
+      <w:r>
+        <w:t>Novelty: Captures information gain relative to earlier sections. It encourages the generator to add new arguments, definitions, or case studies rather than rephrasing previous points.</w:t>
+      </w:r>
+    </w:p>
+    <w:p>
+      <w:r>
+        <w:t>Structure clarity: Assesses whether the subsection uses clear organizational markers, headings, or bullet structures that improve readability. It is especially important in academic documents where structure guides comprehension.</w:t>
+      </w:r>
+    </w:p>
+    <w:p>
+      <w:r>
+        <w:t>Unique citations: Counts the number of distinct citation sources across the document. A higher count indicates that the document draws from diverse references instead of over-relying on a single source.</w:t>
+      </w:r>
+    </w:p>
+    <w:p>
+      <w:r>
+        <w:t>Low-quality citation ratio: Computes the fraction of citations that come from low-quality domains. This metric penalizes reliance on non-academic or unreliable sources.</w:t>
+      </w:r>
+    </w:p>
+    <w:p>
+      <w:r>
+        <w:t>High-quality citations per section: Ensures that each subsection contains at least one high-quality citation. This requirement enforces evidence grounding at a fine-grained level.</w:t>
+      </w:r>
+    </w:p>
+    <w:p>
+      <w:r>
+        <w:t>Domain similarity: Measures how closely the citations’ abstracts align with the document’s extracted index terms. It directly targets cross-domain drift and is implemented using semantic similarity models.</w:t>
+      </w:r>
+    </w:p>
+    <w:p>
+      <w:r>
+        <w:t>Quality score average: Aggregates multi-dimensional scores to give a single document-level quality indicator. This score is used for final pass/fail assessment.</w:t>
+      </w:r>
+    </w:p>
+    <w:p>
+      <w:r>
+        <w:t>Quality uncertainty average: Quantifies the uncertainty of quality estimates. Lower values indicate higher confidence in the scoring process, providing a form of reliability estimation.</w:t>
+      </w:r>
+    </w:p>
+    <w:p>
+      <w:r>
+        <w:t>Pass rate: The fraction of subsections that pass verification within allowed iterations. A high pass rate indicates stable convergence of the repair loop.</w:t>
+      </w:r>
+    </w:p>
+    <w:p>
+      <w:r>
+        <w:t>Iteration efficiency: Measures the average number of iterations required per subsection. Lower values indicate faster convergence and more efficient generation.</w:t>
       </w:r>
     </w:p>
     <w:p>
       <w:pPr>
-        <w:pStyle w:val="Heading1"/>
+        <w:pStyle w:val="Heading2"/>
       </w:pPr>
       <w:r>
-        <w:t>Appendix G. Metrics Catalogue and Interpretation</w:t>
-      </w:r>
-    </w:p>
-    <w:p>
-      <w:r>
-        <w:t>The following catalogue lists the primary metrics tracked by FlowerNet. Each metric contributes to the overall quality gate and is used by the controller and gateway to decide whether outputs meet academic standards. The descriptions emphasize the semantic meaning of each metric and how it influences the closed-loop pipeline.</w:t>
-      </w:r>
-    </w:p>
-    <w:p>
-      <w:r>
-        <w:t>Relevancy index: Measures semantic alignment between the generated subsection and the outline prompt. High relevance indicates that the text stays on topic and does not drift into unrelated content. This metric is computed using a combination of lexical overlap and semantic similarity scores.</w:t>
-      </w:r>
-    </w:p>
-    <w:p>
-      <w:r>
-        <w:t>Redundancy index: Quantifies overlap between the current subsection and historical content. A high redundancy score indicates that the subsection repeats prior information. The controller uses this metric to enforce novelty and to introduce fresh perspectives in subsequent iterations.</w:t>
-      </w:r>
-    </w:p>
-    <w:p>
-      <w:r>
-        <w:t>Topic alignment: Evaluates whether the subsection explicitly addresses the core topic of the outline. It is a stricter version of relevance that penalizes generic explanations and rewards direct engagement with the target concept.</w:t>
-      </w:r>
-    </w:p>
-    <w:p>
-      <w:r>
-        <w:t>Coverage completeness: Estimates how many of the outline’s key points appear in the subsection. This metric is essential for ensuring that the subsection does not omit required subtopics.</w:t>
-      </w:r>
-    </w:p>
-    <w:p>
-      <w:r>
-        <w:t>Logical coherence: Detects gaps in reasoning and evaluates the flow between sentences. Low coherence suggests missing transitions or invalid logical steps, prompting the controller to enforce stronger structure.</w:t>
-      </w:r>
-    </w:p>
-    <w:p>
-      <w:r>
-        <w:t>Evidence grounding: Measures the presence and density of citations, data, or concrete examples. High scores indicate that claims are supported by external evidence rather than generic statements.</w:t>
-      </w:r>
-    </w:p>
-    <w:p>
-      <w:r>
-        <w:t>Novelty: Captures information gain relative to earlier sections. It encourages the generator to add new arguments, definitions, or case studies rather than rephrasing previous points.</w:t>
-      </w:r>
-    </w:p>
-    <w:p>
-      <w:r>
-        <w:t>Structure clarity: Assesses whether the subsection uses clear organizational markers, headings, or bullet structures that improve readability. It is especially important in academic documents where structure guides comprehension.</w:t>
-      </w:r>
-    </w:p>
-    <w:p>
-      <w:r>
-        <w:t>Unique citations: Counts the number of distinct citation sources across the document. A higher count indicates that the document draws from diverse references instead of over-relying on a single source.</w:t>
-      </w:r>
-    </w:p>
-    <w:p>
-      <w:r>
-        <w:t>Low-quality citation ratio: Computes the fraction of citations that come from low-quality domains. This metric penalizes reliance on non-academic or unreliable sources.</w:t>
-      </w:r>
-    </w:p>
-    <w:p>
-      <w:r>
-        <w:t>High-quality citations per section: Ensures that each subsection contains at least one high-quality citation. This requirement enforces evidence grounding at a fine-grained level.</w:t>
-      </w:r>
-    </w:p>
-    <w:p>
-      <w:r>
-        <w:t>Domain similarity: Measures how closely the citations’ abstracts align with the document’s extracted index terms. It directly targets cross-domain drift and is implemented using semantic similarity models.</w:t>
-      </w:r>
-    </w:p>
-    <w:p>
-      <w:r>
-        <w:t>Quality score average: Aggregates multi-dimensional scores to give a single document-level quality indicator. This score is used for final pass/fail assessment.</w:t>
-      </w:r>
-    </w:p>
-    <w:p>
-      <w:r>
-        <w:t>Quality uncertainty average: Quantifies the uncertainty of quality estimates. Lower values indicate higher confidence in the scoring process, providing a form of reliability estimation.</w:t>
-      </w:r>
-    </w:p>
-    <w:p>
-      <w:r>
-        <w:t>Pass rate: The fraction of subsections that pass verification within allowed iterations. A high pass rate indicates stable convergence of the repair loop.</w:t>
-      </w:r>
-    </w:p>
-    <w:p>
-      <w:r>
-        <w:t>Iteration efficiency: Measures the average number of iterations required per subsection. Lower values indicate faster convergence and more efficient generation.</w:t>
+        <w:t>Appendix H. Prompt Engineering Patterns</w:t>
+      </w:r>
+    </w:p>
+    <w:p>
+      <w:r>
+        <w:t>FlowerNet relies on structured prompt engineering to guide the LLMs. Prompts are composed from multiple layers: the subsection outline, a rolling history summary, retrieval evidence, and explicit constraints. This layered prompt design is critical to prevent the model from drifting and to preserve academic tone.</w:t>
+      </w:r>
+    </w:p>
+    <w:p>
+      <w:r>
+        <w:t>The controller’s prompt repair strategies embed targeted constraints based on the verifier’s feedback. For example, if redundancy is high, the controller injects instructions to avoid repetition, emphasize novel examples, and vary terminology. If evidence grounding is weak, it demands explicit citations and factual statements. These prompt patterns are explicitly coded to ensure consistency across iterations.</w:t>
+      </w:r>
+    </w:p>
+    <w:p>
+      <w:r>
+        <w:t>In addition, the generator uses an evidence-checking workflow embedded within the prompt. This workflow instructs the LLM to extract citation abstracts, verify domain alignment, and only cite sources that pass the domain check. This is a unique prompt-level safeguard that complements the retrieval and verification layers.</w:t>
+      </w:r>
+    </w:p>
+    <w:p>
+      <w:r>
+        <w:t>Together, these patterns provide a controlled interface between the system and the LLM. Rather than relying on generic prompts, FlowerNet codifies prompt templates that reflect the system’s quality goals and algorithmic constraints.</w:t>
       </w:r>
     </w:p>
     <w:p>
       <w:pPr>
-        <w:pStyle w:val="Heading1"/>
+        <w:pStyle w:val="Heading2"/>
       </w:pPr>
       <w:r>
-        <w:t>Appendix H. Prompt Engineering Patterns</w:t>
-      </w:r>
-    </w:p>
-    <w:p>
-      <w:r>
-        <w:t>FlowerNet relies on structured prompt engineering to guide the LLMs. Prompts are composed from multiple layers: the subsection outline, a rolling history summary, retrieval evidence, and explicit constraints. This layered prompt design is critical to prevent the model from drifting and to preserve academic tone.</w:t>
-      </w:r>
-    </w:p>
-    <w:p>
-      <w:r>
-        <w:t>The controller’s prompt repair strategies embed targeted constraints based on the verifier’s feedback. For example, if redundancy is high, the controller injects instructions to avoid repetition, emphasize novel examples, and vary terminology. If evidence grounding is weak, it demands explicit citations and factual statements. These prompt patterns are explicitly coded to ensure consistency across iterations.</w:t>
-      </w:r>
-    </w:p>
-    <w:p>
-      <w:r>
-        <w:t>In addition, the generator uses an evidence-checking workflow embedded within the prompt. This workflow instructs the LLM to extract citation abstracts, verify domain alignment, and only cite sources that pass the domain check. This is a unique prompt-level safeguard that complements the retrieval and verification layers.</w:t>
-      </w:r>
-    </w:p>
-    <w:p>
-      <w:r>
-        <w:t>Together, these patterns provide a controlled interface between the system and the LLM. Rather than relying on generic prompts, FlowerNet codifies prompt templates that reflect the system’s quality goals and algorithmic constraints.</w:t>
+        <w:t>Appendix I. Failure Modes and Mitigations</w:t>
+      </w:r>
+    </w:p>
+    <w:p>
+      <w:r>
+        <w:t>The system anticipates multiple failure modes, including provider rate limits, retrieval timeouts, malformed outline JSON, and citation drift. Each failure mode has a dedicated mitigation strategy: provider chaining and backoff for rate limits, time budgets and fallback search sources for retrieval, JSON sanitization and default outline generation for malformed outputs, and verification-driven regeneration for citation drift.</w:t>
+      </w:r>
+    </w:p>
+    <w:p>
+      <w:r>
+        <w:t>Another failure mode is excessive iteration, where a subsection repeatedly fails quality gates. FlowerNet mitigates this through maximum attempt thresholds, dynamic relaxation of relevance and redundancy thresholds after early iterations, and forced exit strategies when time budgets are exhausted. These safeguards prevent runaway latency while still prioritizing quality.</w:t>
+      </w:r>
+    </w:p>
+    <w:p>
+      <w:r>
+        <w:t>Operationally, the system can degrade gracefully. If UniEval is unavailable, heuristic metrics continue to operate. If the history store is down, the generator can temporarily operate in-memory. This layered degradation ensures that the system continues to provide output rather than failing entirely.</w:t>
+      </w:r>
+    </w:p>
+    <w:p>
+      <w:r>
+        <w:t>Finally, the progress event log provides transparency for diagnosing failures. Each iteration’s status, scores, and repair actions are recorded, enabling engineers and evaluators to understand not only what failed but also why and how the system responded.</w:t>
       </w:r>
     </w:p>
     <w:p>
       <w:pPr>
-        <w:pStyle w:val="Heading1"/>
+        <w:pStyle w:val="Heading2"/>
       </w:pPr>
       <w:r>
-        <w:t>Appendix I. Failure Modes and Mitigations</w:t>
-      </w:r>
-    </w:p>
-    <w:p>
-      <w:r>
-        <w:t>The system anticipates multiple failure modes, including provider rate limits, retrieval timeouts, malformed outline JSON, and citation drift. Each failure mode has a dedicated mitigation strategy: provider chaining and backoff for rate limits, time budgets and fallback search sources for retrieval, JSON sanitization and default outline generation for malformed outputs, and verification-driven regeneration for citation drift.</w:t>
-      </w:r>
-    </w:p>
-    <w:p>
-      <w:r>
-        <w:t>Another failure mode is excessive iteration, where a subsection repeatedly fails quality gates. FlowerNet mitigates this through maximum attempt thresholds, dynamic relaxation of relevance and redundancy thresholds after early iterations, and forced exit strategies when time budgets are exhausted. These safeguards prevent runaway latency while still prioritizing quality.</w:t>
-      </w:r>
-    </w:p>
-    <w:p>
-      <w:r>
-        <w:t>Operationally, the system can degrade gracefully. If UniEval is unavailable, heuristic metrics continue to operate. If the history store is down, the generator can temporarily operate in-memory. This layered degradation ensures that the system continues to provide output rather than failing entirely.</w:t>
-      </w:r>
-    </w:p>
-    <w:p>
-      <w:r>
-        <w:t>Finally, the progress event log provides transparency for diagnosing failures. Each iteration’s status, scores, and repair actions are recorded, enabling engineers and evaluators to understand not only what failed but also why and how the system responded.</w:t>
+        <w:t>Appendix J. Performance and Complexity Analysis</w:t>
+      </w:r>
+    </w:p>
+    <w:p>
+      <w:r>
+        <w:t>The computational complexity of FlowerNet is dominated by LLM calls and retrieval operations. For each subsection, the pipeline performs at least one generation call, one verification call, and potentially additional repair cycles. The worst-case complexity grows linearly with the number of subsections and the maximum iteration count. However, adaptive thresholds and bandit strategy selection reduce average iterations in practice.</w:t>
+      </w:r>
+    </w:p>
+    <w:p>
+      <w:r>
+        <w:t>The retrieval component performs multiple query candidates and may query academic sources and web search. This adds overhead but also improves citation quality. Retrieval is bounded by a maximum results parameter and a timeout to ensure that it does not dominate latency. The system’s design thus balances retrieval depth with responsiveness.</w:t>
+      </w:r>
+    </w:p>
+    <w:p>
+      <w:r>
+        <w:t>From an operational perspective, the gateway’s adaptive timeout budgeting and serialization options allow deployments to cap concurrency or increase throughput. The design supports both single-document interactive generation and batch-style processing. The metrics API enables profiling of average iteration counts and can inform future optimization efforts.</w:t>
+      </w:r>
+    </w:p>
+    <w:p>
+      <w:r>
+        <w:t>Memory usage is modest for the orchestrator itself but can grow with the history store. SQLite-backed persistence keeps memory usage stable, while in-memory mode favors speed for smaller workloads. This flexible memory model allows FlowerNet to scale from local experiments to larger deployments.</w:t>
       </w:r>
     </w:p>
     <w:p>
       <w:pPr>
-        <w:pStyle w:val="Heading1"/>
+        <w:pStyle w:val="Heading2"/>
       </w:pPr>
       <w:r>
-        <w:t>Appendix J. Performance and Complexity Analysis</w:t>
-      </w:r>
-    </w:p>
-    <w:p>
-      <w:r>
-        <w:t>The computational complexity of FlowerNet is dominated by LLM calls and retrieval operations. For each subsection, the pipeline performs at least one generation call, one verification call, and potentially additional repair cycles. The worst-case complexity grows linearly with the number of subsections and the maximum iteration count. However, adaptive thresholds and bandit strategy selection reduce average iterations in practice.</w:t>
-      </w:r>
-    </w:p>
-    <w:p>
-      <w:r>
-        <w:t>The retrieval component performs multiple query candidates and may query academic sources and web search. This adds overhead but also improves citation quality. Retrieval is bounded by a maximum results parameter and a timeout to ensure that it does not dominate latency. The system’s design thus balances retrieval depth with responsiveness.</w:t>
-      </w:r>
-    </w:p>
-    <w:p>
-      <w:r>
-        <w:t>From an operational perspective, the gateway’s adaptive timeout budgeting and serialization options allow deployments to cap concurrency or increase throughput. The design supports both single-document interactive generation and batch-style processing. The metrics API enables profiling of average iteration counts and can inform future optimization efforts.</w:t>
-      </w:r>
-    </w:p>
-    <w:p>
-      <w:r>
-        <w:t>Memory usage is modest for the orchestrator itself but can grow with the history store. SQLite-backed persistence keeps memory usage stable, while in-memory mode favors speed for smaller workloads. This flexible memory model allows FlowerNet to scale from local experiments to larger deployments.</w:t>
+        <w:t>Appendix K. Security, Privacy, and Academic Integrity</w:t>
+      </w:r>
+    </w:p>
+    <w:p>
+      <w:r>
+        <w:t>FlowerNet processes potentially sensitive user prompts and generates academic content that could be used in formal submissions. As such, the system includes basic authentication options at the gateway layer, supporting API keys and bearer tokens. These controls are lightweight but sufficient for typical single-user deployments. For larger deployments, integration with stronger identity management would be recommended.</w:t>
+      </w:r>
+    </w:p>
+    <w:p>
+      <w:r>
+        <w:t>Privacy considerations include limiting the storage of user data. The history store is configurable, allowing operators to disable persistence or to store data locally rather than in external databases. This ensures that users can comply with institutional data handling requirements. Additionally, the system avoids embedding sensitive data directly in logs unless explicitly required for debugging.</w:t>
+      </w:r>
+    </w:p>
+    <w:p>
+      <w:r>
+        <w:t>Academic integrity is addressed by the citation-quality mechanisms. The system enforces domain alignment, minimum citations, and evidence grounding. These safeguards reduce the risk of hallucinated sources and encourage verifiable outputs. While no automated system can guarantee originality, FlowerNet’s verification pipeline creates a strong foundation for responsible academic usage.</w:t>
       </w:r>
     </w:p>
     <w:p>
       <w:pPr>
-        <w:pStyle w:val="Heading1"/>
-      </w:pPr>
-      <w:r>
-        <w:t>Appendix K. Security, Privacy, and Academic Integrity</w:t>
-      </w:r>
-    </w:p>
-    <w:p>
-      <w:r>
-        <w:t>FlowerNet processes potentially sensitive user prompts and generates academic content that could be used in formal submissions. As such, the system includes basic authentication options at the gateway layer, supporting API keys and bearer tokens. These controls are lightweight but sufficient for typical single-user deployments. For larger deployments, integration with stronger identity management would be recommended.</w:t>
-      </w:r>
-    </w:p>
-    <w:p>
-      <w:r>
-        <w:t>Privacy considerations include limiting the storage of user data. The history store is configurable, allowing operators to disable persistence or to store data locally rather than in external databases. This ensures that users can comply with institutional data handling requirements. Additionally, the system avoids embedding sensitive data directly in logs unless explicitly required for debugging.</w:t>
-      </w:r>
-    </w:p>
-    <w:p>
-      <w:r>
-        <w:t>Academic integrity is addressed by the citation-quality mechanisms. The system enforces domain alignment, minimum citations, and evidence grounding. These safeguards reduce the risk of hallucinated sources and encourage verifiable outputs. While no automated system can guarantee originality, FlowerNet’s verification pipeline creates a strong foundation for responsible academic usage.</w:t>
-      </w:r>
-    </w:p>
-    <w:p>
-      <w:pPr>
-        <w:pStyle w:val="Heading1"/>
+        <w:pStyle w:val="Heading2"/>
       </w:pPr>
       <w:r>
         <w:t>Appendix L. Comprehensive API Reference</w:t>
@@ -4600,7 +4616,7 @@
     </w:p>
     <w:p>
       <w:pPr>
-        <w:pStyle w:val="Heading1"/>
+        <w:pStyle w:val="Heading2"/>
       </w:pPr>
       <w:r>
         <w:t>Appendix M. Configuration and Tuning Narrative</w:t>
@@ -4633,7 +4649,7 @@
     </w:p>
     <w:p>
       <w:pPr>
-        <w:pStyle w:val="Heading1"/>
+        <w:pStyle w:val="Heading2"/>
       </w:pPr>
       <w:r>
         <w:t>Appendix N. Experimental Design and Validation Protocol</w:t>
@@ -4666,7 +4682,7 @@
     </w:p>
     <w:p>
       <w:pPr>
-        <w:pStyle w:val="Heading1"/>
+        <w:pStyle w:val="Heading2"/>
       </w:pPr>
       <w:r>
         <w:t>Appendix O. Extended Prompt Templates</w:t>
@@ -4962,7 +4978,7 @@
     </w:p>
     <w:p>
       <w:pPr>
-        <w:pStyle w:val="Heading1"/>
+        <w:pStyle w:val="Heading2"/>
       </w:pPr>
       <w:r>
         <w:t>Appendix P. Detailed Data-Flow Trace</w:t>
@@ -5100,7 +5116,7 @@
     </w:p>
     <w:p>
       <w:pPr>
-        <w:pStyle w:val="Heading1"/>
+        <w:pStyle w:val="Heading2"/>
       </w:pPr>
       <w:r>
         <w:t>Appendix Q. Extended Case Study with Metrics</w:t>
@@ -5133,7 +5149,7 @@
     </w:p>
     <w:p>
       <w:pPr>
-        <w:pStyle w:val="Heading1"/>
+        <w:pStyle w:val="Heading2"/>
       </w:pPr>
       <w:r>
         <w:t>Appendix R. Expanded Literature Review</w:t>
@@ -5166,7 +5182,7 @@
     </w:p>
     <w:p>
       <w:pPr>
-        <w:pStyle w:val="Heading1"/>
+        <w:pStyle w:val="Heading2"/>
       </w:pPr>
       <w:r>
         <w:t>Appendix S. Risk Management and Threat Analysis</w:t>
@@ -5194,7 +5210,7 @@
     </w:p>
     <w:p>
       <w:pPr>
-        <w:pStyle w:val="Heading1"/>
+        <w:pStyle w:val="Heading2"/>
       </w:pPr>
       <w:r>
         <w:t>Appendix T. Work Breakdown and Engineering Effort</w:t>
@@ -5222,7 +5238,7 @@
     </w:p>
     <w:p>
       <w:pPr>
-        <w:pStyle w:val="Heading1"/>
+        <w:pStyle w:val="Heading2"/>
       </w:pPr>
       <w:r>
         <w:t>Appendix U. Metric Computation Details</w:t>
@@ -5313,7 +5329,7 @@
     </w:p>
     <w:p>
       <w:pPr>
-        <w:pStyle w:val="Heading1"/>
+        <w:pStyle w:val="Heading2"/>
       </w:pPr>
       <w:r>
         <w:t>Appendix V. Extended Configuration Reference</w:t>
@@ -5978,7 +5994,7 @@
     </w:tbl>
     <w:p>
       <w:pPr>
-        <w:pStyle w:val="Heading1"/>
+        <w:pStyle w:val="Heading2"/>
       </w:pPr>
       <w:r>
         <w:t>Appendix W. Sample Generated Subsection (Illustrative)</w:t>
@@ -6016,7 +6032,7 @@
     </w:p>
     <w:p>
       <w:pPr>
-        <w:pStyle w:val="Heading1"/>
+        <w:pStyle w:val="Heading2"/>
       </w:pPr>
       <w:r>
         <w:t>Appendix X. Comparative Analysis with Baseline Systems</w:t>
@@ -6044,7 +6060,7 @@
     </w:p>
     <w:p>
       <w:pPr>
-        <w:pStyle w:val="Heading1"/>
+        <w:pStyle w:val="Heading2"/>
       </w:pPr>
       <w:r>
         <w:t>Appendix Y. Glossary of Key Terms</w:t>

</xml_diff>